<commit_message>
GraphQL: Updated auto-deployment LAMBDA script
</commit_message>
<xml_diff>
--- a/AWS_Deployment.docx
+++ b/AWS_Deployment.docx
@@ -468,11 +468,7 @@
       </w:pPr>
       <w:r>
         <w:rPr/>
-        <w:t xml:space="preserve">Copy role ARN </w:t>
-      </w:r>
-      <w:r>
-        <w:rPr/>
-        <w:t>and save for auto-deployment</w:t>
+        <w:t>Copy role ARN and save for auto-deployment</w:t>
       </w:r>
     </w:p>
     <w:p>
@@ -1245,7 +1241,6 @@
           <w:rPr>
             <w:rStyle w:val="Hyperlink"/>
             <w:rFonts w:ascii="Amazon Ember;Helvetica Neue;Roboto;Arial;sans-serif" w:hAnsi="Amazon Ember;Helvetica Neue;Roboto;Arial;sans-serif"/>
-            <w:b/>
             <w:b w:val="false"/>
             <w:bCs/>
             <w:i w:val="false"/>
@@ -2110,36 +2105,14 @@
       </w:pPr>
       <w:r>
         <w:rPr/>
-      </w:r>
-    </w:p>
-    <w:p>
-      <w:pPr>
-        <w:pStyle w:val="Normal"/>
-        <w:bidi w:val="0"/>
-        <w:jc w:val="start"/>
-        <w:rPr/>
-      </w:pPr>
-      <w:r>
-        <w:rPr/>
-      </w:r>
-    </w:p>
-    <w:p>
-      <w:pPr>
-        <w:pStyle w:val="Normal"/>
-        <w:bidi w:val="0"/>
-        <w:jc w:val="start"/>
-        <w:rPr/>
-      </w:pPr>
-      <w:r>
-        <w:rPr/>
         <w:drawing>
           <wp:anchor distT="0" distB="0" distL="0" distR="0" simplePos="0" relativeHeight="18" behindDoc="0" locked="0" layoutInCell="0" allowOverlap="1">
             <wp:simplePos x="0" y="0"/>
             <wp:positionH relativeFrom="column">
-              <wp:align>center</wp:align>
+              <wp:posOffset>0</wp:posOffset>
             </wp:positionH>
             <wp:positionV relativeFrom="paragraph">
-              <wp:posOffset>635</wp:posOffset>
+              <wp:posOffset>155575</wp:posOffset>
             </wp:positionV>
             <wp:extent cx="6332220" cy="1943100"/>
             <wp:effectExtent l="0" t="0" r="0" b="0"/>
@@ -2180,6 +2153,313 @@
         </w:drawing>
       </w:r>
     </w:p>
+    <w:p>
+      <w:pPr>
+        <w:pStyle w:val="Normal"/>
+        <w:bidi w:val="0"/>
+        <w:jc w:val="start"/>
+        <w:rPr/>
+      </w:pPr>
+      <w:r>
+        <w:rPr/>
+      </w:r>
+    </w:p>
+    <w:p>
+      <w:pPr>
+        <w:pStyle w:val="Normal"/>
+        <w:bidi w:val="0"/>
+        <w:jc w:val="start"/>
+        <w:rPr/>
+      </w:pPr>
+      <w:r>
+        <w:rPr/>
+      </w:r>
+    </w:p>
+    <w:p>
+      <w:pPr>
+        <w:pStyle w:val="Normal"/>
+        <w:bidi w:val="0"/>
+        <w:jc w:val="start"/>
+        <w:rPr/>
+      </w:pPr>
+      <w:r>
+        <w:rPr/>
+        <w:t xml:space="preserve">Tested auto-deployment: </w:t>
+      </w:r>
+      <w:hyperlink r:id="rId22">
+        <w:r>
+          <w:rPr>
+            <w:rStyle w:val="Hyperlink"/>
+          </w:rPr>
+          <w:t>https://nistl46ujd.execute-api.us-east-1.amazonaws.com/default/GraphQL-FastAPI/graphql</w:t>
+        </w:r>
+      </w:hyperlink>
+    </w:p>
+    <w:p>
+      <w:pPr>
+        <w:pStyle w:val="Normal"/>
+        <w:bidi w:val="0"/>
+        <w:jc w:val="start"/>
+        <w:rPr/>
+      </w:pPr>
+      <w:r>
+        <w:rPr/>
+      </w:r>
+    </w:p>
+    <w:p>
+      <w:pPr>
+        <w:pStyle w:val="Normal"/>
+        <w:bidi w:val="0"/>
+        <w:jc w:val="start"/>
+        <w:rPr/>
+      </w:pPr>
+      <w:hyperlink r:id="rId23">
+        <w:r>
+          <w:rPr>
+            <w:rStyle w:val="Hyperlink"/>
+          </w:rPr>
+          <w:t>https://nistl46ujd.execute-api.us-east-1.amazonaws.com/default/GraphQL-FastAPI/graphql?q=query%20Ex%20%7B%0A%20%20users%20%7B%0A%20%20%20%20name%0A%20%20%20%20age%0A%20%20%20%20phone%0A%20%20%7D%0A%7D</w:t>
+        </w:r>
+      </w:hyperlink>
+    </w:p>
+    <w:p>
+      <w:pPr>
+        <w:pStyle w:val="Normal"/>
+        <w:bidi w:val="0"/>
+        <w:jc w:val="start"/>
+        <w:rPr/>
+      </w:pPr>
+      <w:r>
+        <w:rPr/>
+      </w:r>
+    </w:p>
+    <w:p>
+      <w:pPr>
+        <w:pStyle w:val="Normal"/>
+        <w:bidi w:val="0"/>
+        <w:jc w:val="start"/>
+        <w:rPr/>
+      </w:pPr>
+      <w:r>
+        <w:rPr/>
+        <w:drawing>
+          <wp:anchor distT="0" distB="0" distL="0" distR="0" simplePos="0" relativeHeight="19" behindDoc="0" locked="0" layoutInCell="0" allowOverlap="1">
+            <wp:simplePos x="0" y="0"/>
+            <wp:positionH relativeFrom="column">
+              <wp:align>center</wp:align>
+            </wp:positionH>
+            <wp:positionV relativeFrom="paragraph">
+              <wp:posOffset>635</wp:posOffset>
+            </wp:positionV>
+            <wp:extent cx="6332220" cy="2215515"/>
+            <wp:effectExtent l="0" t="0" r="0" b="0"/>
+            <wp:wrapSquare wrapText="largest"/>
+            <wp:docPr id="18" name="Image18"/>
+            <wp:cNvGraphicFramePr>
+              <a:graphicFrameLocks xmlns:a="http://schemas.openxmlformats.org/drawingml/2006/main" noChangeAspect="1"/>
+            </wp:cNvGraphicFramePr>
+            <a:graphic xmlns:a="http://schemas.openxmlformats.org/drawingml/2006/main">
+              <a:graphicData uri="http://schemas.openxmlformats.org/drawingml/2006/picture">
+                <pic:pic xmlns:pic="http://schemas.openxmlformats.org/drawingml/2006/picture">
+                  <pic:nvPicPr>
+                    <pic:cNvPr id="18" name="Image18"/>
+                    <pic:cNvPicPr>
+                      <a:picLocks noChangeAspect="1" noChangeArrowheads="1"/>
+                    </pic:cNvPicPr>
+                  </pic:nvPicPr>
+                  <pic:blipFill>
+                    <a:blip r:embed="rId24"/>
+                    <a:stretch>
+                      <a:fillRect/>
+                    </a:stretch>
+                  </pic:blipFill>
+                  <pic:spPr bwMode="auto">
+                    <a:xfrm>
+                      <a:off x="0" y="0"/>
+                      <a:ext cx="6332220" cy="2215515"/>
+                    </a:xfrm>
+                    <a:prstGeom prst="rect">
+                      <a:avLst/>
+                    </a:prstGeom>
+                    <a:noFill/>
+                  </pic:spPr>
+                </pic:pic>
+              </a:graphicData>
+            </a:graphic>
+          </wp:anchor>
+        </w:drawing>
+      </w:r>
+    </w:p>
+    <w:p>
+      <w:pPr>
+        <w:pStyle w:val="Normal"/>
+        <w:bidi w:val="0"/>
+        <w:jc w:val="start"/>
+        <w:rPr/>
+      </w:pPr>
+      <w:r>
+        <w:rPr/>
+      </w:r>
+    </w:p>
+    <w:p>
+      <w:pPr>
+        <w:pStyle w:val="Normal"/>
+        <w:bidi w:val="0"/>
+        <w:jc w:val="start"/>
+        <w:rPr/>
+      </w:pPr>
+      <w:r>
+        <w:rPr/>
+      </w:r>
+    </w:p>
+    <w:p>
+      <w:pPr>
+        <w:pStyle w:val="Normal"/>
+        <w:bidi w:val="0"/>
+        <w:jc w:val="start"/>
+        <w:rPr/>
+      </w:pPr>
+      <w:r>
+        <w:rPr/>
+      </w:r>
+    </w:p>
+    <w:p>
+      <w:pPr>
+        <w:pStyle w:val="Normal"/>
+        <w:bidi w:val="0"/>
+        <w:jc w:val="start"/>
+        <w:rPr/>
+      </w:pPr>
+      <w:r>
+        <w:rPr/>
+      </w:r>
+    </w:p>
+    <w:p>
+      <w:pPr>
+        <w:pStyle w:val="Normal"/>
+        <w:bidi w:val="0"/>
+        <w:jc w:val="start"/>
+        <w:rPr/>
+      </w:pPr>
+      <w:r>
+        <w:rPr/>
+      </w:r>
+    </w:p>
+    <w:p>
+      <w:pPr>
+        <w:pStyle w:val="Normal"/>
+        <w:bidi w:val="0"/>
+        <w:jc w:val="start"/>
+        <w:rPr/>
+      </w:pPr>
+      <w:r>
+        <w:rPr/>
+      </w:r>
+    </w:p>
+    <w:p>
+      <w:pPr>
+        <w:pStyle w:val="Normal"/>
+        <w:bidi w:val="0"/>
+        <w:jc w:val="start"/>
+        <w:rPr/>
+      </w:pPr>
+      <w:r>
+        <w:rPr/>
+        <w:t>query Ex {</w:t>
+      </w:r>
+    </w:p>
+    <w:p>
+      <w:pPr>
+        <w:pStyle w:val="Normal"/>
+        <w:bidi w:val="0"/>
+        <w:jc w:val="start"/>
+        <w:rPr/>
+      </w:pPr>
+      <w:r>
+        <w:rPr/>
+        <w:t xml:space="preserve">  </w:t>
+      </w:r>
+      <w:r>
+        <w:rPr/>
+        <w:t>users {</w:t>
+      </w:r>
+    </w:p>
+    <w:p>
+      <w:pPr>
+        <w:pStyle w:val="Normal"/>
+        <w:bidi w:val="0"/>
+        <w:jc w:val="start"/>
+        <w:rPr/>
+      </w:pPr>
+      <w:r>
+        <w:rPr/>
+        <w:t xml:space="preserve">    </w:t>
+      </w:r>
+      <w:r>
+        <w:rPr/>
+        <w:t>name</w:t>
+      </w:r>
+    </w:p>
+    <w:p>
+      <w:pPr>
+        <w:pStyle w:val="Normal"/>
+        <w:bidi w:val="0"/>
+        <w:jc w:val="start"/>
+        <w:rPr/>
+      </w:pPr>
+      <w:r>
+        <w:rPr/>
+        <w:t xml:space="preserve">    </w:t>
+      </w:r>
+      <w:r>
+        <w:rPr/>
+        <w:t>age</w:t>
+      </w:r>
+    </w:p>
+    <w:p>
+      <w:pPr>
+        <w:pStyle w:val="Normal"/>
+        <w:bidi w:val="0"/>
+        <w:jc w:val="start"/>
+        <w:rPr/>
+      </w:pPr>
+      <w:r>
+        <w:rPr/>
+        <w:t xml:space="preserve">    </w:t>
+      </w:r>
+      <w:r>
+        <w:rPr/>
+        <w:t>phone</w:t>
+      </w:r>
+    </w:p>
+    <w:p>
+      <w:pPr>
+        <w:pStyle w:val="Normal"/>
+        <w:bidi w:val="0"/>
+        <w:jc w:val="start"/>
+        <w:rPr/>
+      </w:pPr>
+      <w:r>
+        <w:rPr/>
+        <w:t xml:space="preserve">  </w:t>
+      </w:r>
+      <w:r>
+        <w:rPr/>
+        <w:t>}</w:t>
+      </w:r>
+    </w:p>
+    <w:p>
+      <w:pPr>
+        <w:pStyle w:val="Normal"/>
+        <w:bidi w:val="0"/>
+        <w:jc w:val="start"/>
+        <w:rPr/>
+      </w:pPr>
+      <w:r>
+        <w:rPr/>
+        <w:t>}</w:t>
+      </w:r>
+    </w:p>
     <w:sectPr>
       <w:type w:val="nextPage"/>
       <w:pgSz w:w="12240" w:h="15840"/>
@@ -2187,6 +2467,7 @@
       <w:pgNumType w:fmt="decimal"/>
       <w:formProt w:val="false"/>
       <w:textDirection w:val="lrTb"/>
+      <w:docGrid w:type="default" w:linePitch="100" w:charSpace="0"/>
     </w:sectPr>
   </w:body>
 </w:document>
@@ -2206,7 +2487,6 @@
     </w:rPrDefault>
     <w:pPrDefault>
       <w:pPr>
-        <w:widowControl/>
         <w:suppressAutoHyphens w:val="true"/>
       </w:pPr>
     </w:pPrDefault>
@@ -2216,7 +2496,10 @@
     <w:qFormat/>
     <w:pPr>
       <w:widowControl/>
+      <w:suppressAutoHyphens w:val="true"/>
       <w:bidi w:val="0"/>
+      <w:spacing w:before="0" w:after="0"/>
+      <w:jc w:val="start"/>
     </w:pPr>
     <w:rPr>
       <w:rFonts w:ascii="Liberation Serif" w:hAnsi="Liberation Serif" w:eastAsia="NSimSun" w:cs="Lucida Sans"/>

</xml_diff>